<commit_message>
Update page numbers in OS_Practical-3.pdf to reflect correct enrollment details
</commit_message>
<xml_diff>
--- a/Practicals/OS_Practical-3.docx
+++ b/Practicals/OS_Practical-3.docx
@@ -147,7 +147,17 @@
                 <w:sz w:val="32"/>
                 <w:szCs w:val="32"/>
               </w:rPr>
-              <w:t xml:space="preserve"> System</w:t>
+              <w:t xml:space="preserve"> </w:t>
+            </w:r>
+            <w:proofErr w:type="gramStart"/>
+            <w:r>
+              <w:rPr>
+                <w:rFonts w:ascii="Times New Roman" w:hAnsi="Times New Roman"/>
+                <w:b/>
+                <w:sz w:val="32"/>
+                <w:szCs w:val="32"/>
+              </w:rPr>
+              <w:t>System</w:t>
             </w:r>
             <w:r>
               <w:rPr>
@@ -181,6 +191,7 @@
               </w:rPr>
               <w:t>]</w:t>
             </w:r>
+            <w:proofErr w:type="gramEnd"/>
           </w:p>
         </w:tc>
       </w:tr>
@@ -384,7 +395,25 @@
                                 <w:color w:val="000000"/>
                                 <w:lang w:val="en-IN" w:eastAsia="zh-CN" w:bidi="ar"/>
                               </w:rPr>
-                              <w:t>Implements Shell script using decision making statement, branching and Looping.</w:t>
+                              <w:t xml:space="preserve">Implements Shell script using decision making statement, branching and </w:t>
+                            </w:r>
+                            <w:proofErr w:type="gramStart"/>
+                            <w:r>
+                              <w:rPr>
+                                <w:rFonts w:ascii="Times New Roman" w:eastAsia="Bell MT" w:hAnsi="Times New Roman"/>
+                                <w:color w:val="000000"/>
+                                <w:lang w:val="en-IN" w:eastAsia="zh-CN" w:bidi="ar"/>
+                              </w:rPr>
+                              <w:t>Looping</w:t>
+                            </w:r>
+                            <w:proofErr w:type="gramEnd"/>
+                            <w:r>
+                              <w:rPr>
+                                <w:rFonts w:ascii="Times New Roman" w:eastAsia="Bell MT" w:hAnsi="Times New Roman"/>
+                                <w:color w:val="000000"/>
+                                <w:lang w:val="en-IN" w:eastAsia="zh-CN" w:bidi="ar"/>
+                              </w:rPr>
+                              <w:t>.</w:t>
                             </w:r>
                           </w:p>
                           <w:p>
@@ -945,7 +974,29 @@
           <w:szCs w:val="24"/>
           <w:lang w:val="en-IN" w:eastAsia="zh-CN" w:bidi="ar"/>
         </w:rPr>
-        <w:t>Implements Shell script using decision making statement, branching and Looping.</w:t>
+        <w:t xml:space="preserve">Implements Shell script using decision making statement, branching and </w:t>
+      </w:r>
+      <w:proofErr w:type="gramStart"/>
+      <w:r>
+        <w:rPr>
+          <w:rFonts w:ascii="Times New Roman" w:eastAsia="Bell MT" w:hAnsi="Times New Roman"/>
+          <w:color w:val="000000"/>
+          <w:sz w:val="24"/>
+          <w:szCs w:val="24"/>
+          <w:lang w:val="en-IN" w:eastAsia="zh-CN" w:bidi="ar"/>
+        </w:rPr>
+        <w:t>Looping</w:t>
+      </w:r>
+      <w:proofErr w:type="gramEnd"/>
+      <w:r>
+        <w:rPr>
+          <w:rFonts w:ascii="Times New Roman" w:eastAsia="Bell MT" w:hAnsi="Times New Roman"/>
+          <w:color w:val="000000"/>
+          <w:sz w:val="24"/>
+          <w:szCs w:val="24"/>
+          <w:lang w:val="en-IN" w:eastAsia="zh-CN" w:bidi="ar"/>
+        </w:rPr>
+        <w:t>.</w:t>
       </w:r>
     </w:p>
     <w:p>
@@ -1471,6 +1522,7 @@
           <w:rFonts w:ascii="Times New Roman" w:hAnsi="Times New Roman"/>
           <w:b/>
           <w:bCs/>
+          <w:noProof/>
           <w:sz w:val="24"/>
           <w:szCs w:val="24"/>
           <w:lang w:val="en-IN"/>
@@ -1693,8 +1745,19 @@
           <w:szCs w:val="24"/>
           <w:lang w:val="en-IN"/>
         </w:rPr>
-        <w:t xml:space="preserve"> 1 ]</w:t>
-      </w:r>
+        <w:t xml:space="preserve"> </w:t>
+      </w:r>
+      <w:proofErr w:type="gramStart"/>
+      <w:r>
+        <w:rPr>
+          <w:rFonts w:ascii="Times New Roman" w:hAnsi="Times New Roman"/>
+          <w:sz w:val="24"/>
+          <w:szCs w:val="24"/>
+          <w:lang w:val="en-IN"/>
+        </w:rPr>
+        <w:t>1 ]</w:t>
+      </w:r>
+      <w:proofErr w:type="gramEnd"/>
     </w:p>
     <w:p>
       <w:pPr>
@@ -1841,8 +1904,19 @@
           <w:szCs w:val="24"/>
           <w:lang w:val="en-IN"/>
         </w:rPr>
-        <w:t xml:space="preserve"> 50 ]</w:t>
-      </w:r>
+        <w:t xml:space="preserve"> </w:t>
+      </w:r>
+      <w:proofErr w:type="gramStart"/>
+      <w:r>
+        <w:rPr>
+          <w:rFonts w:ascii="Times New Roman" w:hAnsi="Times New Roman"/>
+          <w:sz w:val="24"/>
+          <w:szCs w:val="24"/>
+          <w:lang w:val="en-IN"/>
+        </w:rPr>
+        <w:t>50 ]</w:t>
+      </w:r>
+      <w:proofErr w:type="gramEnd"/>
     </w:p>
     <w:p>
       <w:pPr>
@@ -1879,7 +1953,27 @@
           <w:szCs w:val="24"/>
           <w:lang w:val="en-IN"/>
         </w:rPr>
-        <w:t xml:space="preserve">        echo "Please Enter Number less </w:t>
+        <w:t xml:space="preserve">        echo "Please Enter Number </w:t>
+      </w:r>
+      <w:proofErr w:type="gramStart"/>
+      <w:r>
+        <w:rPr>
+          <w:rFonts w:ascii="Times New Roman" w:hAnsi="Times New Roman"/>
+          <w:sz w:val="24"/>
+          <w:szCs w:val="24"/>
+          <w:lang w:val="en-IN"/>
+        </w:rPr>
+        <w:t>less</w:t>
+      </w:r>
+      <w:proofErr w:type="gramEnd"/>
+      <w:r>
+        <w:rPr>
+          <w:rFonts w:ascii="Times New Roman" w:hAnsi="Times New Roman"/>
+          <w:sz w:val="24"/>
+          <w:szCs w:val="24"/>
+          <w:lang w:val="en-IN"/>
+        </w:rPr>
+        <w:t xml:space="preserve"> </w:t>
       </w:r>
       <w:proofErr w:type="spellStart"/>
       <w:r>
@@ -2068,6 +2162,7 @@
         <w:t xml:space="preserve">    echo "Do you want to continue? (</w:t>
       </w:r>
       <w:proofErr w:type="spellStart"/>
+      <w:proofErr w:type="gramStart"/>
       <w:r>
         <w:rPr>
           <w:rFonts w:ascii="Times New Roman" w:hAnsi="Times New Roman"/>
@@ -2078,6 +2173,7 @@
         <w:t>y,n</w:t>
       </w:r>
       <w:proofErr w:type="spellEnd"/>
+      <w:proofErr w:type="gramEnd"/>
       <w:r>
         <w:rPr>
           <w:rFonts w:ascii="Times New Roman" w:hAnsi="Times New Roman"/>
@@ -2154,7 +2250,27 @@
           <w:szCs w:val="24"/>
           <w:lang w:val="en-IN"/>
         </w:rPr>
-        <w:t xml:space="preserve"> = "n" ] || [ $</w:t>
+        <w:t xml:space="preserve"> = "n</w:t>
+      </w:r>
+      <w:proofErr w:type="gramStart"/>
+      <w:r>
+        <w:rPr>
+          <w:rFonts w:ascii="Times New Roman" w:hAnsi="Times New Roman"/>
+          <w:sz w:val="24"/>
+          <w:szCs w:val="24"/>
+          <w:lang w:val="en-IN"/>
+        </w:rPr>
+        <w:t>" ]</w:t>
+      </w:r>
+      <w:proofErr w:type="gramEnd"/>
+      <w:r>
+        <w:rPr>
+          <w:rFonts w:ascii="Times New Roman" w:hAnsi="Times New Roman"/>
+          <w:sz w:val="24"/>
+          <w:szCs w:val="24"/>
+          <w:lang w:val="en-IN"/>
+        </w:rPr>
+        <w:t xml:space="preserve"> || [ $</w:t>
       </w:r>
       <w:proofErr w:type="spellStart"/>
       <w:r>
@@ -2312,6 +2428,7 @@
           <w:rFonts w:ascii="Times New Roman" w:hAnsi="Times New Roman"/>
           <w:b/>
           <w:bCs/>
+          <w:noProof/>
           <w:sz w:val="24"/>
           <w:szCs w:val="24"/>
           <w:lang w:val="en-IN"/>
@@ -2526,6 +2643,7 @@
           <w:rFonts w:ascii="Times New Roman" w:hAnsi="Times New Roman"/>
           <w:b/>
           <w:bCs/>
+          <w:noProof/>
           <w:sz w:val="24"/>
           <w:szCs w:val="24"/>
           <w:lang w:val="en-IN"/>
@@ -2706,8 +2824,19 @@
           <w:szCs w:val="24"/>
           <w:lang w:val="en-IN"/>
         </w:rPr>
-        <w:t xml:space="preserve"> 0 ]</w:t>
-      </w:r>
+        <w:t xml:space="preserve"> </w:t>
+      </w:r>
+      <w:proofErr w:type="gramStart"/>
+      <w:r>
+        <w:rPr>
+          <w:rFonts w:ascii="Times New Roman" w:hAnsi="Times New Roman"/>
+          <w:sz w:val="24"/>
+          <w:szCs w:val="24"/>
+          <w:lang w:val="en-IN"/>
+        </w:rPr>
+        <w:t>0 ]</w:t>
+      </w:r>
+      <w:proofErr w:type="gramEnd"/>
     </w:p>
     <w:p>
       <w:pPr>
@@ -2843,6 +2972,7 @@
           <w:rFonts w:ascii="Times New Roman" w:hAnsi="Times New Roman"/>
           <w:b/>
           <w:bCs/>
+          <w:noProof/>
           <w:sz w:val="24"/>
           <w:szCs w:val="24"/>
           <w:lang w:val="en-IN"/>
@@ -3096,6 +3226,7 @@
       <w:r>
         <w:rPr>
           <w:rFonts w:ascii="Times New Roman" w:hAnsi="Times New Roman"/>
+          <w:noProof/>
           <w:sz w:val="24"/>
           <w:szCs w:val="24"/>
           <w:lang w:val="en-IN"/>
@@ -3319,7 +3450,27 @@
           <w:szCs w:val="24"/>
           <w:lang w:val="en-IN"/>
         </w:rPr>
-        <w:t>" = *"$str1"* ] ]</w:t>
+        <w:t>" = *"$str1"</w:t>
+      </w:r>
+      <w:proofErr w:type="gramStart"/>
+      <w:r>
+        <w:rPr>
+          <w:rFonts w:ascii="Times New Roman" w:hAnsi="Times New Roman"/>
+          <w:sz w:val="24"/>
+          <w:szCs w:val="24"/>
+          <w:lang w:val="en-IN"/>
+        </w:rPr>
+        <w:t>* ]</w:t>
+      </w:r>
+      <w:proofErr w:type="gramEnd"/>
+      <w:r>
+        <w:rPr>
+          <w:rFonts w:ascii="Times New Roman" w:hAnsi="Times New Roman"/>
+          <w:sz w:val="24"/>
+          <w:szCs w:val="24"/>
+          <w:lang w:val="en-IN"/>
+        </w:rPr>
+        <w:t xml:space="preserve"> ]</w:t>
       </w:r>
     </w:p>
     <w:p>
@@ -3456,6 +3607,7 @@
       <w:r>
         <w:rPr>
           <w:rFonts w:ascii="Times New Roman" w:hAnsi="Times New Roman"/>
+          <w:noProof/>
           <w:sz w:val="24"/>
           <w:szCs w:val="24"/>
           <w:lang w:val="en-IN"/>
@@ -3764,7 +3916,27 @@
           <w:szCs w:val="24"/>
           <w:lang w:val="en-IN"/>
         </w:rPr>
-        <w:t>fib=("$num1" "$num2")</w:t>
+        <w:t>fib</w:t>
+      </w:r>
+      <w:proofErr w:type="gramStart"/>
+      <w:r>
+        <w:rPr>
+          <w:rFonts w:ascii="Times New Roman" w:hAnsi="Times New Roman"/>
+          <w:sz w:val="24"/>
+          <w:szCs w:val="24"/>
+          <w:lang w:val="en-IN"/>
+        </w:rPr>
+        <w:t>=(</w:t>
+      </w:r>
+      <w:proofErr w:type="gramEnd"/>
+      <w:r>
+        <w:rPr>
+          <w:rFonts w:ascii="Times New Roman" w:hAnsi="Times New Roman"/>
+          <w:sz w:val="24"/>
+          <w:szCs w:val="24"/>
+          <w:lang w:val="en-IN"/>
+        </w:rPr>
+        <w:t>"$num1" "$num2")</w:t>
       </w:r>
     </w:p>
     <w:p>
@@ -3806,6 +3978,7 @@
         <w:t xml:space="preserve"> $</w:t>
       </w:r>
       <w:proofErr w:type="spellStart"/>
+      <w:proofErr w:type="gramStart"/>
       <w:r>
         <w:rPr>
           <w:rFonts w:ascii="Times New Roman" w:hAnsi="Times New Roman"/>
@@ -3825,6 +3998,7 @@
         </w:rPr>
         <w:t xml:space="preserve"> ]</w:t>
       </w:r>
+      <w:proofErr w:type="gramEnd"/>
     </w:p>
     <w:p>
       <w:pPr>
@@ -3940,8 +4114,19 @@
           <w:szCs w:val="24"/>
           <w:lang w:val="en-IN"/>
         </w:rPr>
-        <w:t>]} + ${fib[$i+1]}`</w:t>
-      </w:r>
+        <w:t>]} + ${fib[$i+1</w:t>
+      </w:r>
+      <w:proofErr w:type="gramStart"/>
+      <w:r>
+        <w:rPr>
+          <w:rFonts w:ascii="Times New Roman" w:hAnsi="Times New Roman"/>
+          <w:sz w:val="24"/>
+          <w:szCs w:val="24"/>
+          <w:lang w:val="en-IN"/>
+        </w:rPr>
+        <w:t>]}`</w:t>
+      </w:r>
+      <w:proofErr w:type="gramEnd"/>
     </w:p>
     <w:p>
       <w:pPr>
@@ -3962,6 +4147,7 @@
         <w:t xml:space="preserve">    fib[$</w:t>
       </w:r>
       <w:proofErr w:type="spellStart"/>
+      <w:proofErr w:type="gramStart"/>
       <w:r>
         <w:rPr>
           <w:rFonts w:ascii="Times New Roman" w:hAnsi="Times New Roman"/>
@@ -3979,7 +4165,17 @@
           <w:szCs w:val="24"/>
           <w:lang w:val="en-IN"/>
         </w:rPr>
-        <w:t>]=$temp</w:t>
+        <w:t>]=</w:t>
+      </w:r>
+      <w:proofErr w:type="gramEnd"/>
+      <w:r>
+        <w:rPr>
+          <w:rFonts w:ascii="Times New Roman" w:hAnsi="Times New Roman"/>
+          <w:sz w:val="24"/>
+          <w:szCs w:val="24"/>
+          <w:lang w:val="en-IN"/>
+        </w:rPr>
+        <w:t>$temp</w:t>
       </w:r>
     </w:p>
     <w:p>
@@ -4096,7 +4292,27 @@
           <w:szCs w:val="24"/>
           <w:lang w:val="en-IN"/>
         </w:rPr>
-        <w:t xml:space="preserve"> Series: ${fib[@]}"</w:t>
+        <w:t xml:space="preserve"> Series: ${</w:t>
+      </w:r>
+      <w:proofErr w:type="gramStart"/>
+      <w:r>
+        <w:rPr>
+          <w:rFonts w:ascii="Times New Roman" w:hAnsi="Times New Roman"/>
+          <w:sz w:val="24"/>
+          <w:szCs w:val="24"/>
+          <w:lang w:val="en-IN"/>
+        </w:rPr>
+        <w:t>fib[</w:t>
+      </w:r>
+      <w:proofErr w:type="gramEnd"/>
+      <w:r>
+        <w:rPr>
+          <w:rFonts w:ascii="Times New Roman" w:hAnsi="Times New Roman"/>
+          <w:sz w:val="24"/>
+          <w:szCs w:val="24"/>
+          <w:lang w:val="en-IN"/>
+        </w:rPr>
+        <w:t>@]}"</w:t>
       </w:r>
     </w:p>
     <w:p>
@@ -4134,6 +4350,7 @@
       <w:r>
         <w:rPr>
           <w:rFonts w:ascii="Times New Roman" w:hAnsi="Times New Roman"/>
+          <w:noProof/>
           <w:sz w:val="24"/>
           <w:szCs w:val="24"/>
           <w:lang w:val="en-IN"/>
@@ -4180,7 +4397,7 @@
       <w:footerReference w:type="default" r:id="rId19"/>
       <w:pgSz w:w="12240" w:h="15840"/>
       <w:pgMar w:top="1440" w:right="1440" w:bottom="1440" w:left="1440" w:header="720" w:footer="720" w:gutter="0"/>
-      <w:pgNumType w:start="21"/>
+      <w:pgNumType w:start="20"/>
       <w:cols w:space="720"/>
       <w:titlePg/>
       <w:docGrid w:linePitch="360"/>

</xml_diff>